<commit_message>
Actualiza documento de enlace de GitHub
</commit_message>
<xml_diff>
--- a/src/ENLACE DEL REPOSITORIO GITHUB.docx
+++ b/src/ENLACE DEL REPOSITORIO GITHUB.docx
@@ -60,16 +60,8 @@
         <w:rPr>
           <w:rFonts w:ascii="Arial" w:hAnsi="Arial" w:cs="Arial"/>
         </w:rPr>
-        <w:t xml:space="preserve">GA7-220501096-AA5-EV02 – API. </w:t>
-      </w:r>
-      <w:proofErr w:type="spellStart"/>
-      <w:r>
-        <w:rPr>
-          <w:rFonts w:ascii="Arial" w:hAnsi="Arial" w:cs="Arial"/>
-        </w:rPr>
-        <w:t>Testing</w:t>
-      </w:r>
-      <w:proofErr w:type="spellEnd"/>
+        <w:t>GA7-220501096-AA5-EV02 – API. Testing</w:t>
+      </w:r>
     </w:p>
     <w:p>
       <w:pPr>
@@ -253,17 +245,7 @@
           <w:sz w:val="28"/>
           <w:szCs w:val="28"/>
         </w:rPr>
-        <w:t>ENLACE DEL REPOSITORIO</w:t>
-      </w:r>
-      <w:r>
-        <w:rPr>
-          <w:rFonts w:ascii="Arial" w:hAnsi="Arial" w:cs="Arial"/>
-          <w:b/>
-          <w:bCs/>
-          <w:sz w:val="28"/>
-          <w:szCs w:val="28"/>
-        </w:rPr>
-        <w:t>:</w:t>
+        <w:t>ENLACE DEL REPOSITORIO:</w:t>
       </w:r>
     </w:p>
     <w:p>
@@ -284,21 +266,7 @@
         <w:rPr>
           <w:rFonts w:ascii="Arial" w:hAnsi="Arial" w:cs="Arial"/>
         </w:rPr>
-        <w:t xml:space="preserve">l proyecto Colonial House API fue desarrollado utilizando Node.js y Express. El código fuente, los documentos de la evidencia y los archivos principales del proyecto fueron subidos al repositorio de GitHub para llevar el control y </w:t>
-      </w:r>
-      <w:proofErr w:type="spellStart"/>
-      <w:r>
-        <w:rPr>
-          <w:rFonts w:ascii="Arial" w:hAnsi="Arial" w:cs="Arial"/>
-        </w:rPr>
-        <w:t>versionamiento</w:t>
-      </w:r>
-      <w:proofErr w:type="spellEnd"/>
-      <w:r>
-        <w:rPr>
-          <w:rFonts w:ascii="Arial" w:hAnsi="Arial" w:cs="Arial"/>
-        </w:rPr>
-        <w:t xml:space="preserve"> del proyecto.</w:t>
+        <w:t>l proyecto Colonial House API fue desarrollado utilizando Node.js y Express. El código fuente, los documentos de la evidencia y los archivos principales del proyecto fueron subidos al repositorio de GitHub para llevar el control y versionamiento del proyecto.</w:t>
       </w:r>
     </w:p>
     <w:p>
@@ -380,17 +348,7 @@
           <w:sz w:val="28"/>
           <w:szCs w:val="28"/>
         </w:rPr>
-        <w:t>CONTENIDO DEL REPOSITORIO</w:t>
-      </w:r>
-      <w:r>
-        <w:rPr>
-          <w:rFonts w:ascii="Arial" w:hAnsi="Arial" w:cs="Arial"/>
-          <w:b/>
-          <w:bCs/>
-          <w:sz w:val="28"/>
-          <w:szCs w:val="28"/>
-        </w:rPr>
-        <w:t>:</w:t>
+        <w:t>CONTENIDO DEL REPOSITORIO:</w:t>
       </w:r>
     </w:p>
     <w:p>
@@ -501,23 +459,7 @@
         <w:rPr>
           <w:rFonts w:ascii="Arial" w:hAnsi="Arial" w:cs="Arial"/>
         </w:rPr>
-        <w:t xml:space="preserve">Archivo </w:t>
-      </w:r>
-      <w:proofErr w:type="spellStart"/>
-      <w:proofErr w:type="gramStart"/>
-      <w:r>
-        <w:rPr>
-          <w:rFonts w:ascii="Arial" w:hAnsi="Arial" w:cs="Arial"/>
-        </w:rPr>
-        <w:t>package.json</w:t>
-      </w:r>
-      <w:proofErr w:type="spellEnd"/>
-      <w:proofErr w:type="gramEnd"/>
-      <w:r>
-        <w:rPr>
-          <w:rFonts w:ascii="Arial" w:hAnsi="Arial" w:cs="Arial"/>
-        </w:rPr>
-        <w:t>.</w:t>
+        <w:t>Archivo package.json.</w:t>
       </w:r>
     </w:p>
     <w:p>
@@ -535,29 +477,7 @@
         <w:rPr>
           <w:rFonts w:ascii="Arial" w:hAnsi="Arial" w:cs="Arial"/>
         </w:rPr>
-        <w:t xml:space="preserve">Archivo </w:t>
-      </w:r>
-      <w:proofErr w:type="spellStart"/>
-      <w:r>
-        <w:rPr>
-          <w:rFonts w:ascii="Arial" w:hAnsi="Arial" w:cs="Arial"/>
-        </w:rPr>
-        <w:t>package-</w:t>
-      </w:r>
-      <w:proofErr w:type="gramStart"/>
-      <w:r>
-        <w:rPr>
-          <w:rFonts w:ascii="Arial" w:hAnsi="Arial" w:cs="Arial"/>
-        </w:rPr>
-        <w:t>lock.json</w:t>
-      </w:r>
-      <w:proofErr w:type="spellEnd"/>
-      <w:proofErr w:type="gramEnd"/>
-      <w:r>
-        <w:rPr>
-          <w:rFonts w:ascii="Arial" w:hAnsi="Arial" w:cs="Arial"/>
-        </w:rPr>
-        <w:t>.</w:t>
+        <w:t>Archivo package-lock.json.</w:t>
       </w:r>
     </w:p>
     <w:p>
@@ -594,21 +514,7 @@
           <w:rFonts w:ascii="Arial" w:hAnsi="Arial" w:cs="Arial"/>
         </w:rPr>
         <w:lastRenderedPageBreak/>
-        <w:t xml:space="preserve">Documento con los </w:t>
-      </w:r>
-      <w:proofErr w:type="spellStart"/>
-      <w:r>
-        <w:rPr>
-          <w:rFonts w:ascii="Arial" w:hAnsi="Arial" w:cs="Arial"/>
-        </w:rPr>
-        <w:t>endpoints</w:t>
-      </w:r>
-      <w:proofErr w:type="spellEnd"/>
-      <w:r>
-        <w:rPr>
-          <w:rFonts w:ascii="Arial" w:hAnsi="Arial" w:cs="Arial"/>
-        </w:rPr>
-        <w:t xml:space="preserve"> de Colonial House API.</w:t>
+        <w:t>Documento con los endpoints de Colonial House API.</w:t>
       </w:r>
     </w:p>
     <w:p>
@@ -665,21 +571,55 @@
         <w:rPr>
           <w:rFonts w:ascii="Arial" w:hAnsi="Arial" w:cs="Arial"/>
         </w:rPr>
-        <w:t xml:space="preserve">omo evidencia del proceso de </w:t>
-      </w:r>
-      <w:proofErr w:type="spellStart"/>
-      <w:r>
-        <w:rPr>
-          <w:rFonts w:ascii="Arial" w:hAnsi="Arial" w:cs="Arial"/>
-        </w:rPr>
-        <w:t>versionamiento</w:t>
-      </w:r>
-      <w:proofErr w:type="spellEnd"/>
-      <w:r>
-        <w:rPr>
-          <w:rFonts w:ascii="Arial" w:hAnsi="Arial" w:cs="Arial"/>
-        </w:rPr>
-        <w:t>, se incluye una captura de pantalla del repositorio de GitHub donde se pueden observar los archivos del proyecto y los documentos correspondientes a la evidencia.</w:t>
+        <w:t>omo evidencia del proceso de versionamiento, se incluye una captura de pantalla del repositorio de GitHub donde se pueden observar los archivos del proyecto y los documentos correspondientes a la evidencia.</w:t>
+      </w:r>
+    </w:p>
+    <w:p>
+      <w:pPr>
+        <w:pStyle w:val="NormalWeb"/>
+        <w:rPr>
+          <w:rFonts w:ascii="Arial" w:hAnsi="Arial" w:cs="Arial"/>
+        </w:rPr>
+      </w:pPr>
+      <w:r>
+        <w:rPr>
+          <w:rFonts w:ascii="Arial" w:hAnsi="Arial" w:cs="Arial"/>
+        </w:rPr>
+        <w:drawing>
+          <wp:inline distT="0" distB="0" distL="0" distR="0" wp14:anchorId="08AF8E77" wp14:editId="57EAECEE">
+            <wp:extent cx="5612130" cy="2305685"/>
+            <wp:effectExtent l="0" t="0" r="7620" b="0"/>
+            <wp:docPr id="1662020681" name="Imagen 1"/>
+            <wp:cNvGraphicFramePr>
+              <a:graphicFrameLocks xmlns:a="http://schemas.openxmlformats.org/drawingml/2006/main" noChangeAspect="1"/>
+            </wp:cNvGraphicFramePr>
+            <a:graphic xmlns:a="http://schemas.openxmlformats.org/drawingml/2006/main">
+              <a:graphicData uri="http://schemas.openxmlformats.org/drawingml/2006/picture">
+                <pic:pic xmlns:pic="http://schemas.openxmlformats.org/drawingml/2006/picture">
+                  <pic:nvPicPr>
+                    <pic:cNvPr id="1662020681" name=""/>
+                    <pic:cNvPicPr/>
+                  </pic:nvPicPr>
+                  <pic:blipFill>
+                    <a:blip r:embed="rId6"/>
+                    <a:stretch>
+                      <a:fillRect/>
+                    </a:stretch>
+                  </pic:blipFill>
+                  <pic:spPr>
+                    <a:xfrm>
+                      <a:off x="0" y="0"/>
+                      <a:ext cx="5612130" cy="2305685"/>
+                    </a:xfrm>
+                    <a:prstGeom prst="rect">
+                      <a:avLst/>
+                    </a:prstGeom>
+                  </pic:spPr>
+                </pic:pic>
+              </a:graphicData>
+            </a:graphic>
+          </wp:inline>
+        </w:drawing>
       </w:r>
     </w:p>
     <w:p>
@@ -1675,6 +1615,7 @@
   <w:style w:type="character" w:default="1" w:styleId="Fuentedeprrafopredeter">
     <w:name w:val="Default Paragraph Font"/>
     <w:uiPriority w:val="1"/>
+    <w:semiHidden/>
     <w:unhideWhenUsed/>
   </w:style>
   <w:style w:type="table" w:default="1" w:styleId="Tablanormal">

</xml_diff>